<commit_message>
Update the build step for kernel module - to build just module without building complete kernel
</commit_message>
<xml_diff>
--- a/Docs/Compliation_steps/Build-image-module/Linux_Kernel_Rebuild_module_for_Driver_Modification.docx
+++ b/Docs/Compliation_steps/Build-image-module/Linux_Kernel_Rebuild_module_for_Driver_Modification.docx
@@ -172,12 +172,151 @@
     </w:p>
     <w:p>
       <w:pPr>
+        <w:pStyle w:val="Normal"/>
+        <w:rPr>
+          <w:rFonts w:ascii="Courier New" w:hAnsi="Courier New"/>
+          <w:b/>
+          <w:b/>
+          <w:bCs/>
+          <w:sz w:val="20"/>
+          <w:szCs w:val="20"/>
+        </w:rPr>
+      </w:pPr>
+      <w:r>
+        <w:rPr/>
+      </w:r>
+    </w:p>
+    <w:p>
+      <w:pPr>
+        <w:pStyle w:val="Heading2"/>
+        <w:rPr>
+          <w:rFonts w:ascii="Calibri" w:hAnsi="Calibri"/>
+          <w:sz w:val="26"/>
+          <w:szCs w:val="26"/>
+        </w:rPr>
+      </w:pPr>
+      <w:r>
+        <w:rPr>
+          <w:rFonts w:ascii="Calibri" w:hAnsi="Calibri"/>
+          <w:b/>
+          <w:bCs/>
+          <w:sz w:val="26"/>
+          <w:szCs w:val="26"/>
+        </w:rPr>
+        <w:t xml:space="preserve">Step </w:t>
+      </w:r>
+      <w:r>
+        <w:rPr>
+          <w:rFonts w:ascii="Calibri" w:hAnsi="Calibri"/>
+          <w:b/>
+          <w:bCs/>
+          <w:sz w:val="26"/>
+          <w:szCs w:val="26"/>
+        </w:rPr>
+        <w:t>3</w:t>
+      </w:r>
+      <w:r>
+        <w:rPr>
+          <w:rFonts w:ascii="Calibri" w:hAnsi="Calibri"/>
+          <w:b/>
+          <w:bCs/>
+          <w:sz w:val="26"/>
+          <w:szCs w:val="26"/>
+        </w:rPr>
+        <w:t xml:space="preserve">: </w:t>
+      </w:r>
+      <w:r>
+        <w:rPr>
+          <w:rFonts w:ascii="Calibri" w:hAnsi="Calibri"/>
+          <w:b/>
+          <w:bCs/>
+          <w:sz w:val="26"/>
+          <w:szCs w:val="26"/>
+        </w:rPr>
+        <w:t>Force the deploy task(Don’t build all task)</w:t>
+      </w:r>
+    </w:p>
+    <w:p>
+      <w:pPr>
+        <w:pStyle w:val="Normal"/>
+        <w:rPr>
+          <w:rFonts w:ascii="Courier new" w:hAnsi="Courier new"/>
+          <w:color w:val="8064A2"/>
+          <w:sz w:val="20"/>
+          <w:szCs w:val="20"/>
+        </w:rPr>
+      </w:pPr>
+      <w:r>
+        <w:rPr>
+          <w:rFonts w:ascii="Courier new" w:hAnsi="Courier new"/>
+          <w:b/>
+          <w:bCs/>
+          <w:color w:val="8064A2"/>
+          <w:sz w:val="20"/>
+          <w:szCs w:val="20"/>
+        </w:rPr>
+        <w:t>bitbake linux-qcom-custom -c deploy -f</w:t>
+      </w:r>
+    </w:p>
+    <w:p>
+      <w:pPr>
+        <w:pStyle w:val="Normal"/>
+        <w:rPr>
+          <w:b/>
+          <w:b/>
+          <w:bCs/>
+        </w:rPr>
+      </w:pPr>
+      <w:r>
+        <w:rPr>
+          <w:rFonts w:ascii="Courier new" w:hAnsi="Courier new"/>
+          <w:color w:val="8064A2"/>
+          <w:sz w:val="20"/>
+          <w:szCs w:val="20"/>
+        </w:rPr>
+      </w:r>
+    </w:p>
+    <w:p>
+      <w:pPr>
+        <w:pStyle w:val="Normal"/>
+        <w:rPr>
+          <w:rFonts w:ascii="Courier new" w:hAnsi="Courier new"/>
+          <w:color w:val="000000"/>
+          <w:sz w:val="20"/>
+          <w:szCs w:val="20"/>
+        </w:rPr>
+      </w:pPr>
+      <w:r>
+        <w:rPr>
+          <w:rFonts w:ascii="Courier new" w:hAnsi="Courier new"/>
+          <w:b/>
+          <w:bCs/>
+          <w:i w:val="false"/>
+          <w:caps w:val="false"/>
+          <w:smallCaps w:val="false"/>
+          <w:color w:val="000000"/>
+          <w:sz w:val="20"/>
+          <w:szCs w:val="20"/>
+        </w:rPr>
+        <w:t>Forcefully rerun the deploy task for the custom kernel and copy the kernel outputs again to the deploy directory.</w:t>
+      </w:r>
+    </w:p>
+    <w:p>
+      <w:pPr>
         <w:pStyle w:val="Heading2"/>
         <w:rPr/>
       </w:pPr>
       <w:r>
         <w:rPr/>
-        <w:t>Step 3: Modify Driver Source Code (stmmac)</w:t>
+        <w:t xml:space="preserve">Step </w:t>
+      </w:r>
+      <w:r>
+        <w:rPr/>
+        <w:t>4</w:t>
+      </w:r>
+      <w:r>
+        <w:rPr/>
+        <w:t>: Modify Driver Source Code (stmmac)</w:t>
       </w:r>
     </w:p>
     <w:p>
@@ -273,7 +412,15 @@
       </w:pPr>
       <w:r>
         <w:rPr/>
-        <w:t>Step 4: Compile Driver Module</w:t>
+        <w:t xml:space="preserve">Step </w:t>
+      </w:r>
+      <w:r>
+        <w:rPr/>
+        <w:t>5</w:t>
+      </w:r>
+      <w:r>
+        <w:rPr/>
+        <w:t>: Compile Driver Module</w:t>
       </w:r>
     </w:p>
     <w:p>
@@ -308,7 +455,15 @@
       </w:pPr>
       <w:r>
         <w:rPr/>
-        <w:t>Step 5: Locate .ko File</w:t>
+        <w:t xml:space="preserve">Step </w:t>
+      </w:r>
+      <w:r>
+        <w:rPr/>
+        <w:t>6</w:t>
+      </w:r>
+      <w:r>
+        <w:rPr/>
+        <w:t>: Locate .ko File</w:t>
       </w:r>
     </w:p>
     <w:p>
@@ -373,7 +528,15 @@
       </w:pPr>
       <w:r>
         <w:rPr/>
-        <w:t>Step 6: Transfer Module to Board</w:t>
+        <w:t xml:space="preserve">Step </w:t>
+      </w:r>
+      <w:r>
+        <w:rPr/>
+        <w:t>7</w:t>
+      </w:r>
+      <w:r>
+        <w:rPr/>
+        <w:t>: Transfer Module to Board</w:t>
       </w:r>
     </w:p>
     <w:p>
@@ -451,7 +614,15 @@
       </w:pPr>
       <w:r>
         <w:rPr/>
-        <w:t>Step 7: Check Existing Modules</w:t>
+        <w:t xml:space="preserve">Step </w:t>
+      </w:r>
+      <w:r>
+        <w:rPr/>
+        <w:t>8</w:t>
+      </w:r>
+      <w:r>
+        <w:rPr/>
+        <w:t>: Check Existing Modules</w:t>
       </w:r>
     </w:p>
     <w:p>
@@ -486,7 +657,15 @@
       </w:pPr>
       <w:r>
         <w:rPr/>
-        <w:t>Step 8: Remove Existing Module and Dependencies</w:t>
+        <w:t xml:space="preserve">Step </w:t>
+      </w:r>
+      <w:r>
+        <w:rPr/>
+        <w:t>9</w:t>
+      </w:r>
+      <w:r>
+        <w:rPr/>
+        <w:t>: Remove Existing Module and Dependencies</w:t>
       </w:r>
     </w:p>
     <w:p>
@@ -600,7 +779,15 @@
       </w:pPr>
       <w:r>
         <w:rPr/>
-        <w:t>Step 9: Insert New Module</w:t>
+        <w:t xml:space="preserve">Step </w:t>
+      </w:r>
+      <w:r>
+        <w:rPr/>
+        <w:t>10</w:t>
+      </w:r>
+      <w:r>
+        <w:rPr/>
+        <w:t>: Insert New Module</w:t>
       </w:r>
     </w:p>
     <w:p>
@@ -635,7 +822,15 @@
       </w:pPr>
       <w:r>
         <w:rPr/>
-        <w:t>Step 10: Load Dependencies</w:t>
+        <w:t>Step 1</w:t>
+      </w:r>
+      <w:r>
+        <w:rPr/>
+        <w:t>1</w:t>
+      </w:r>
+      <w:r>
+        <w:rPr/>
+        <w:t>: Load Dependencies</w:t>
       </w:r>
     </w:p>
     <w:p>
@@ -685,7 +880,15 @@
       </w:pPr>
       <w:r>
         <w:rPr/>
-        <w:t>Step 11: Bring Interface Up</w:t>
+        <w:t>Step 1</w:t>
+      </w:r>
+      <w:r>
+        <w:rPr/>
+        <w:t>2</w:t>
+      </w:r>
+      <w:r>
+        <w:rPr/>
+        <w:t>: Bring Interface Up</w:t>
       </w:r>
     </w:p>
     <w:p>
@@ -720,7 +923,15 @@
       </w:pPr>
       <w:r>
         <w:rPr/>
-        <w:t>Step 12: Verify Logs</w:t>
+        <w:t>Step 1</w:t>
+      </w:r>
+      <w:r>
+        <w:rPr/>
+        <w:t>3</w:t>
+      </w:r>
+      <w:r>
+        <w:rPr/>
+        <w:t>: Verify Logs</w:t>
       </w:r>
     </w:p>
     <w:p>
@@ -1260,6 +1471,7 @@
         </w:tabs>
         <w:ind w:left="1080" w:hanging="360"/>
       </w:pPr>
+      <w:rPr/>
     </w:lvl>
     <w:lvl w:ilvl="2">
       <w:start w:val="1"/>
@@ -1272,6 +1484,7 @@
         </w:tabs>
         <w:ind w:left="1440" w:hanging="360"/>
       </w:pPr>
+      <w:rPr/>
     </w:lvl>
     <w:lvl w:ilvl="3">
       <w:start w:val="1"/>
@@ -1284,6 +1497,7 @@
         </w:tabs>
         <w:ind w:left="1800" w:hanging="360"/>
       </w:pPr>
+      <w:rPr/>
     </w:lvl>
     <w:lvl w:ilvl="4">
       <w:start w:val="1"/>
@@ -1296,6 +1510,7 @@
         </w:tabs>
         <w:ind w:left="2160" w:hanging="360"/>
       </w:pPr>
+      <w:rPr/>
     </w:lvl>
     <w:lvl w:ilvl="5">
       <w:start w:val="1"/>
@@ -1308,6 +1523,7 @@
         </w:tabs>
         <w:ind w:left="2520" w:hanging="360"/>
       </w:pPr>
+      <w:rPr/>
     </w:lvl>
     <w:lvl w:ilvl="6">
       <w:start w:val="1"/>
@@ -1320,6 +1536,7 @@
         </w:tabs>
         <w:ind w:left="2880" w:hanging="360"/>
       </w:pPr>
+      <w:rPr/>
     </w:lvl>
     <w:lvl w:ilvl="7">
       <w:start w:val="1"/>
@@ -1332,6 +1549,7 @@
         </w:tabs>
         <w:ind w:left="3240" w:hanging="360"/>
       </w:pPr>
+      <w:rPr/>
     </w:lvl>
     <w:lvl w:ilvl="8">
       <w:start w:val="1"/>
@@ -1344,6 +1562,7 @@
         </w:tabs>
         <w:ind w:left="3600" w:hanging="360"/>
       </w:pPr>
+      <w:rPr/>
     </w:lvl>
   </w:abstractNum>
   <w:abstractNum w:abstractNumId="2">
@@ -1373,6 +1592,7 @@
         </w:tabs>
         <w:ind w:left="1080" w:hanging="360"/>
       </w:pPr>
+      <w:rPr/>
     </w:lvl>
     <w:lvl w:ilvl="2">
       <w:start w:val="1"/>
@@ -1385,6 +1605,7 @@
         </w:tabs>
         <w:ind w:left="1440" w:hanging="360"/>
       </w:pPr>
+      <w:rPr/>
     </w:lvl>
     <w:lvl w:ilvl="3">
       <w:start w:val="1"/>
@@ -1397,6 +1618,7 @@
         </w:tabs>
         <w:ind w:left="1800" w:hanging="360"/>
       </w:pPr>
+      <w:rPr/>
     </w:lvl>
     <w:lvl w:ilvl="4">
       <w:start w:val="1"/>
@@ -1409,6 +1631,7 @@
         </w:tabs>
         <w:ind w:left="2160" w:hanging="360"/>
       </w:pPr>
+      <w:rPr/>
     </w:lvl>
     <w:lvl w:ilvl="5">
       <w:start w:val="1"/>
@@ -1421,6 +1644,7 @@
         </w:tabs>
         <w:ind w:left="2520" w:hanging="360"/>
       </w:pPr>
+      <w:rPr/>
     </w:lvl>
     <w:lvl w:ilvl="6">
       <w:start w:val="1"/>
@@ -1433,6 +1657,7 @@
         </w:tabs>
         <w:ind w:left="2880" w:hanging="360"/>
       </w:pPr>
+      <w:rPr/>
     </w:lvl>
     <w:lvl w:ilvl="7">
       <w:start w:val="1"/>
@@ -1445,6 +1670,7 @@
         </w:tabs>
         <w:ind w:left="3240" w:hanging="360"/>
       </w:pPr>
+      <w:rPr/>
     </w:lvl>
     <w:lvl w:ilvl="8">
       <w:start w:val="1"/>
@@ -1457,6 +1683,7 @@
         </w:tabs>
         <w:ind w:left="3600" w:hanging="360"/>
       </w:pPr>
+      <w:rPr/>
     </w:lvl>
   </w:abstractNum>
   <w:abstractNum w:abstractNumId="3">
@@ -1486,6 +1713,7 @@
         </w:tabs>
         <w:ind w:left="1080" w:hanging="360"/>
       </w:pPr>
+      <w:rPr/>
     </w:lvl>
     <w:lvl w:ilvl="2">
       <w:start w:val="1"/>
@@ -1498,6 +1726,7 @@
         </w:tabs>
         <w:ind w:left="1440" w:hanging="360"/>
       </w:pPr>
+      <w:rPr/>
     </w:lvl>
     <w:lvl w:ilvl="3">
       <w:start w:val="1"/>
@@ -1510,6 +1739,7 @@
         </w:tabs>
         <w:ind w:left="1800" w:hanging="360"/>
       </w:pPr>
+      <w:rPr/>
     </w:lvl>
     <w:lvl w:ilvl="4">
       <w:start w:val="1"/>
@@ -1522,6 +1752,7 @@
         </w:tabs>
         <w:ind w:left="2160" w:hanging="360"/>
       </w:pPr>
+      <w:rPr/>
     </w:lvl>
     <w:lvl w:ilvl="5">
       <w:start w:val="1"/>
@@ -1534,6 +1765,7 @@
         </w:tabs>
         <w:ind w:left="2520" w:hanging="360"/>
       </w:pPr>
+      <w:rPr/>
     </w:lvl>
     <w:lvl w:ilvl="6">
       <w:start w:val="1"/>
@@ -1546,6 +1778,7 @@
         </w:tabs>
         <w:ind w:left="2880" w:hanging="360"/>
       </w:pPr>
+      <w:rPr/>
     </w:lvl>
     <w:lvl w:ilvl="7">
       <w:start w:val="1"/>
@@ -1558,6 +1791,7 @@
         </w:tabs>
         <w:ind w:left="3240" w:hanging="360"/>
       </w:pPr>
+      <w:rPr/>
     </w:lvl>
     <w:lvl w:ilvl="8">
       <w:start w:val="1"/>
@@ -1570,6 +1804,7 @@
         </w:tabs>
         <w:ind w:left="3600" w:hanging="360"/>
       </w:pPr>
+      <w:rPr/>
     </w:lvl>
   </w:abstractNum>
   <w:abstractNum w:abstractNumId="4">
@@ -1597,6 +1832,7 @@
         </w:tabs>
         <w:ind w:left="1080" w:hanging="360"/>
       </w:pPr>
+      <w:rPr/>
     </w:lvl>
     <w:lvl w:ilvl="2">
       <w:start w:val="1"/>
@@ -1609,6 +1845,7 @@
         </w:tabs>
         <w:ind w:left="1440" w:hanging="360"/>
       </w:pPr>
+      <w:rPr/>
     </w:lvl>
     <w:lvl w:ilvl="3">
       <w:start w:val="1"/>
@@ -1621,6 +1858,7 @@
         </w:tabs>
         <w:ind w:left="1800" w:hanging="360"/>
       </w:pPr>
+      <w:rPr/>
     </w:lvl>
     <w:lvl w:ilvl="4">
       <w:start w:val="1"/>
@@ -1633,6 +1871,7 @@
         </w:tabs>
         <w:ind w:left="2160" w:hanging="360"/>
       </w:pPr>
+      <w:rPr/>
     </w:lvl>
     <w:lvl w:ilvl="5">
       <w:start w:val="1"/>
@@ -1645,6 +1884,7 @@
         </w:tabs>
         <w:ind w:left="2520" w:hanging="360"/>
       </w:pPr>
+      <w:rPr/>
     </w:lvl>
     <w:lvl w:ilvl="6">
       <w:start w:val="1"/>
@@ -1657,6 +1897,7 @@
         </w:tabs>
         <w:ind w:left="2880" w:hanging="360"/>
       </w:pPr>
+      <w:rPr/>
     </w:lvl>
     <w:lvl w:ilvl="7">
       <w:start w:val="1"/>
@@ -1669,6 +1910,7 @@
         </w:tabs>
         <w:ind w:left="3240" w:hanging="360"/>
       </w:pPr>
+      <w:rPr/>
     </w:lvl>
     <w:lvl w:ilvl="8">
       <w:start w:val="1"/>
@@ -1681,6 +1923,7 @@
         </w:tabs>
         <w:ind w:left="3600" w:hanging="360"/>
       </w:pPr>
+      <w:rPr/>
     </w:lvl>
   </w:abstractNum>
   <w:abstractNum w:abstractNumId="5">
@@ -1708,6 +1951,7 @@
         </w:tabs>
         <w:ind w:left="1080" w:hanging="360"/>
       </w:pPr>
+      <w:rPr/>
     </w:lvl>
     <w:lvl w:ilvl="2">
       <w:start w:val="1"/>
@@ -1720,6 +1964,7 @@
         </w:tabs>
         <w:ind w:left="1440" w:hanging="360"/>
       </w:pPr>
+      <w:rPr/>
     </w:lvl>
     <w:lvl w:ilvl="3">
       <w:start w:val="1"/>
@@ -1732,6 +1977,7 @@
         </w:tabs>
         <w:ind w:left="1800" w:hanging="360"/>
       </w:pPr>
+      <w:rPr/>
     </w:lvl>
     <w:lvl w:ilvl="4">
       <w:start w:val="1"/>
@@ -1744,6 +1990,7 @@
         </w:tabs>
         <w:ind w:left="2160" w:hanging="360"/>
       </w:pPr>
+      <w:rPr/>
     </w:lvl>
     <w:lvl w:ilvl="5">
       <w:start w:val="1"/>
@@ -1756,6 +2003,7 @@
         </w:tabs>
         <w:ind w:left="2520" w:hanging="360"/>
       </w:pPr>
+      <w:rPr/>
     </w:lvl>
     <w:lvl w:ilvl="6">
       <w:start w:val="1"/>
@@ -1768,6 +2016,7 @@
         </w:tabs>
         <w:ind w:left="2880" w:hanging="360"/>
       </w:pPr>
+      <w:rPr/>
     </w:lvl>
     <w:lvl w:ilvl="7">
       <w:start w:val="1"/>
@@ -1780,6 +2029,7 @@
         </w:tabs>
         <w:ind w:left="3240" w:hanging="360"/>
       </w:pPr>
+      <w:rPr/>
     </w:lvl>
     <w:lvl w:ilvl="8">
       <w:start w:val="1"/>
@@ -1792,6 +2042,7 @@
         </w:tabs>
         <w:ind w:left="3600" w:hanging="360"/>
       </w:pPr>
+      <w:rPr/>
     </w:lvl>
   </w:abstractNum>
   <w:abstractNum w:abstractNumId="6">
@@ -1819,6 +2070,7 @@
         </w:tabs>
         <w:ind w:left="1080" w:hanging="360"/>
       </w:pPr>
+      <w:rPr/>
     </w:lvl>
     <w:lvl w:ilvl="2">
       <w:start w:val="1"/>
@@ -1831,6 +2083,7 @@
         </w:tabs>
         <w:ind w:left="1440" w:hanging="360"/>
       </w:pPr>
+      <w:rPr/>
     </w:lvl>
     <w:lvl w:ilvl="3">
       <w:start w:val="1"/>
@@ -1843,6 +2096,7 @@
         </w:tabs>
         <w:ind w:left="1800" w:hanging="360"/>
       </w:pPr>
+      <w:rPr/>
     </w:lvl>
     <w:lvl w:ilvl="4">
       <w:start w:val="1"/>
@@ -1855,6 +2109,7 @@
         </w:tabs>
         <w:ind w:left="2160" w:hanging="360"/>
       </w:pPr>
+      <w:rPr/>
     </w:lvl>
     <w:lvl w:ilvl="5">
       <w:start w:val="1"/>
@@ -1867,6 +2122,7 @@
         </w:tabs>
         <w:ind w:left="2520" w:hanging="360"/>
       </w:pPr>
+      <w:rPr/>
     </w:lvl>
     <w:lvl w:ilvl="6">
       <w:start w:val="1"/>
@@ -1879,6 +2135,7 @@
         </w:tabs>
         <w:ind w:left="2880" w:hanging="360"/>
       </w:pPr>
+      <w:rPr/>
     </w:lvl>
     <w:lvl w:ilvl="7">
       <w:start w:val="1"/>
@@ -1891,6 +2148,7 @@
         </w:tabs>
         <w:ind w:left="3240" w:hanging="360"/>
       </w:pPr>
+      <w:rPr/>
     </w:lvl>
     <w:lvl w:ilvl="8">
       <w:start w:val="1"/>
@@ -1903,6 +2161,7 @@
         </w:tabs>
         <w:ind w:left="3600" w:hanging="360"/>
       </w:pPr>
+      <w:rPr/>
     </w:lvl>
   </w:abstractNum>
   <w:abstractNum w:abstractNumId="7">
@@ -2210,6 +2469,7 @@
     <w:rsid w:val="00fc693f"/>
     <w:pPr>
       <w:widowControl/>
+      <w:suppressAutoHyphens w:val="true"/>
       <w:bidi w:val="0"/>
       <w:spacing w:lineRule="auto" w:line="276" w:before="0" w:after="200"/>
       <w:jc w:val="left"/>
@@ -2902,6 +3162,7 @@
     <w:rsid w:val="00fc693f"/>
     <w:pPr>
       <w:widowControl/>
+      <w:suppressAutoHyphens w:val="true"/>
       <w:bidi w:val="0"/>
       <w:spacing w:lineRule="auto" w:line="240" w:before="0" w:after="0"/>
       <w:jc w:val="left"/>
@@ -3000,24 +3261,29 @@
       <w:szCs w:val="16"/>
     </w:rPr>
   </w:style>
-  <w:style w:type="paragraph" w:styleId="List2">
+  <w:style w:type="paragraph" w:styleId="ListBullet3">
     <w:name w:val="List Bullet 3"/>
     <w:basedOn w:val="Normal"/>
     <w:uiPriority w:val="99"/>
     <w:unhideWhenUsed/>
+    <w:qFormat/>
     <w:rsid w:val="00326f90"/>
     <w:pPr>
+      <w:numPr>
+        <w:ilvl w:val="0"/>
+        <w:numId w:val="3"/>
+      </w:numPr>
       <w:spacing w:before="0" w:after="200"/>
-      <w:ind w:left="720" w:hanging="360"/>
       <w:contextualSpacing/>
     </w:pPr>
     <w:rPr/>
   </w:style>
-  <w:style w:type="paragraph" w:styleId="List3">
+  <w:style w:type="paragraph" w:styleId="ListBullet4">
     <w:name w:val="List Bullet 4"/>
     <w:basedOn w:val="Normal"/>
     <w:uiPriority w:val="99"/>
     <w:unhideWhenUsed/>
+    <w:qFormat/>
     <w:rsid w:val="00326f90"/>
     <w:pPr>
       <w:spacing w:before="0" w:after="200"/>
@@ -3054,23 +3320,6 @@
       <w:numPr>
         <w:ilvl w:val="0"/>
         <w:numId w:val="2"/>
-      </w:numPr>
-      <w:spacing w:before="0" w:after="200"/>
-      <w:contextualSpacing/>
-    </w:pPr>
-    <w:rPr/>
-  </w:style>
-  <w:style w:type="paragraph" w:styleId="ListBullet3">
-    <w:name w:val="List Bullet 3"/>
-    <w:basedOn w:val="Normal"/>
-    <w:uiPriority w:val="99"/>
-    <w:unhideWhenUsed/>
-    <w:qFormat/>
-    <w:rsid w:val="00326f90"/>
-    <w:pPr>
-      <w:numPr>
-        <w:ilvl w:val="0"/>
-        <w:numId w:val="3"/>
       </w:numPr>
       <w:spacing w:before="0" w:after="200"/>
       <w:contextualSpacing/>
@@ -3189,6 +3438,7 @@
         <w:tab w:val="left" w:pos="3456" w:leader="none"/>
         <w:tab w:val="left" w:pos="4032" w:leader="none"/>
       </w:tabs>
+      <w:suppressAutoHyphens w:val="true"/>
       <w:bidi w:val="0"/>
       <w:spacing w:lineRule="auto" w:line="276" w:before="0" w:after="200"/>
       <w:jc w:val="left"/>

</xml_diff>